<commit_message>
feat: synchronize Holdout Validation FY24-25, weekly reports, and standalone Vercel web application
</commit_message>
<xml_diff>
--- a/EDA dashboard Python/Capstone_Weekly_Report 25.10.26.docx
+++ b/EDA dashboard Python/Capstone_Weekly_Report 25.10.26.docx
@@ -95,7 +95,7 @@
         <w:spacing w:before="40" w:after="120"/>
       </w:pPr>
       <w:r>
-        <w:t>The team successfully executed real-world out-of-sample holdout validation across FY24-25 (2024-07-01 to 2025-06-30; 444,274 ODU units) backed by a 14-point mathematical verification suite with 100% pass (14/14). Benchmarked against legacy systems on total billed demand, our current production engine achieved an empirical error reduction to 38.2% WAPE at South Region x Month (vs 42.7% original) and 39.9% at Branch x Month (vs 49.5% original), while correcting structural forecast bias from -22.6% to +5.4%. In parallel, the team modernized the analytical platform by streamlining dashboard.py (-1,300+ lines of technical debt), deploying a dedicated Forecast Studio (src/forecast_studio.py) and interactive Holdout Validation interface (src/holdout_validation_page.py), expanded the candidate model zoo to 16 algorithms, achieved 100% pass on the automated test suite (48 passed / 0 failed), and compiled the comprehensive Capstone Final Report package (final_report/ISB_Capstone_Final_Report.docx and PDF).</w:t>
+        <w:t>The team successfully executed real-world out-of-sample holdout validation across FY24-25 (2024-07-01 to 2025-06-30; 444,274 ODU units) backed by a 14-point mathematical verification suite with 100% pass (14/14). Benchmarked against legacy systems on total billed demand, our current production engine achieved an empirical error reduction to 38.2% WAPE at South Region x Month (vs 42.7% original) and 39.9% at Branch x Month (vs 49.5% original), while correcting structural forecast bias from -22.6% to +5.4%. In parallel, the team modernized the analytical platform by streamlining dashboard.py (-1,300+ lines of technical debt), deploying a dedicated Forecast Studio (src/forecast_studio.py) and interactive Holdout Validation interface (src/holdout_validation_page.py), expanded the candidate model zoo to 17 algorithms, achieved 100% pass on the automated test suite (50 passed / 0 failed), and compiled the comprehensive Capstone Final Report package (final_report/ISB_Capstone_Final_Report.docx and PDF).</w:t>
       </w:r>
     </w:p>
     <w:p>
@@ -278,7 +278,7 @@
         <w:t xml:space="preserve">16-Model Tournament Zoo: </w:t>
       </w:r>
       <w:r>
-        <w:t>Expanded candidate model zoo to 16 algorithms (src/forecasting/model_zoo.py) spanning Statistical (Seasonal Index, Smooth Seasonal Index, SARIMA(52), ETS, ARIMA, Exponential Smoothing, Moving Average, Naive, Seasonal Naive), Intermittent (Croston, SBA, TSB), Machine Learning (LightGBM, XGBoost, Random Forest, Gradient Boosting), and inverse-WAPE Consensus Ensemble.</w:t>
+        <w:t>Expanded candidate model zoo to 17 algorithms (src/forecasting/model_zoo.py) spanning Statistical (Seasonal Index, Smooth Seasonal Index, SARIMA(52), ETS, ARIMA, Exponential Smoothing, Moving Average, Naive, Seasonal Naive), Intermittent (Croston, SBA, TSB), Machine Learning (LightGBM, XGBoost, Random Forest, Gradient Boosting), and inverse-WAPE Consensus Ensemble.</w:t>
       </w:r>
     </w:p>
     <w:p>
@@ -392,7 +392,7 @@
         <w:t xml:space="preserve">Automated Test Suite Pass (48/48): </w:t>
       </w:r>
       <w:r>
-        <w:t>Maintained comprehensive automated test coverage with 48 passed / 0 failed, certifying that data ingestion, feature generation, backtesting, metrics, and reconciliation operate with 100% test integrity.</w:t>
+        <w:t>Maintained comprehensive automated test coverage with 50 passed / 0 failed, certifying that data ingestion, feature generation, backtesting, metrics, and reconciliation operate with 100% test integrity.</w:t>
       </w:r>
     </w:p>
     <w:p>

</xml_diff>